<commit_message>
Fix authentication and add independent review document jobs
</commit_message>
<xml_diff>
--- a/templates/review-docs/lyrics-all.docx
+++ b/templates/review-docs/lyrics-all.docx
@@ -57,7 +57,7 @@
     <w:p>
       <w:pPr>
         <w:keepNext/>
-        <w:spacing w:after="40"/>
+        <w:spacing w:before="220" w:after="40" w:line="276" w:lineRule="auto"/>
       </w:pPr>
       <w:r>
         <w:rPr>
@@ -73,6 +73,7 @@
     </w:p>
     <w:p>
       <w:pPr>
+        <w:keepNext/>
         <w:spacing w:after="40"/>
       </w:pPr>
       <w:r>
@@ -87,7 +88,10 @@
     </w:p>
     <w:p>
       <w:pPr>
-        <w:spacing w:after="12"/>
+        <w:jc w:val="left"/>
+        <w:snapToGrid w:val="0"/>
+        <w:widowControl/>
+        <w:spacing w:after="30" w:line="276" w:lineRule="auto"/>
       </w:pPr>
       <w:r>
         <w:rPr>

</xml_diff>